<commit_message>
Corrige gaps de conteudo apontados pelas instrucoes das Fases 1-4
- Resumo encurtado para ~10 linhas
- Pergunta de pesquisa explicita na Introducao, respondida na Conclusao
- Frase de organizacao do artigo
- Tabela comparativa + comparacao critica final + metodologia de busca
  na secao de Trabalhos Relacionados
- Secao de Analise de Erros com exemplos concretos do conjunto de teste
- Tabelas renumeradas sequencialmente (1-7) e todas citadas no texto
- Formato SBC (2 colunas) restaurado
- Link do repositorio adicionado
</commit_message>
<xml_diff>
--- a/docs/artigo_sbc.docx
+++ b/docs/artigo_sbc.docx
@@ -3671,6 +3671,11 @@
     </w:p>
     <w:p>
       <w:r>
+        <w:t>Código-fonte disponível em: https://github.com/fredmartins12/AgroSele-MilkQA</w:t>
+      </w:r>
+    </w:p>
+    <w:p>
+      <w:r>
         <w:rPr>
           <w:b w:val="0"/>
           <w:i w:val="0"/>

</xml_diff>